<commit_message>
With new analysis of PU prediction and DOCX generation
</commit_message>
<xml_diff>
--- a/Pickup_Accuracy_Report_by_LOT.docx
+++ b/Pickup_Accuracy_Report_by_LOT.docx
@@ -11,8 +11,11 @@
       </w:r>
     </w:p>
     <w:p>
+      <w:pPr>
+        <w:jc w:val="both"/>
+      </w:pPr>
       <w:r>
-        <w:t>This document contains the results of applying the moving window extrapolation method for the prediction         of pickups for future dates for each lot separately. This method was used because the data cannot be used for pickups prediction, it already            assumes that a chassie loan was performed. The future pickups prediction problem answers a different question entirely - whether there                will be a pickup or not. This method used a comb of last values of sums of pickups from a lot, and extrapolates using an automatic                    algorithm that optimizes the least error extrapolation model (linear, quadratic or cubic).</w:t>
+        <w:t>This document contains the results of applying the moving window extrapolation method for the prediction         of pickups for future dates for each lot separately. This method was used because the data cannot be used for pickups prediction, it already            assumes that a chassis loan was performed. The future pickups prediction problem answers a different question entirely - whether there                will be a pickup or not. This method used a comb of last values of sums of pickups from a lot, and extrapolates using an automatic                    algorithm that optimizes the least error extrapolation model (linear, quadratic or cubic).</w:t>
       </w:r>
     </w:p>
     <w:p>
@@ -26,13 +29,9 @@
         <w:pStyle w:val="Heading2"/>
       </w:pPr>
       <w:r>
-        <w:t>Pickup Prediction Results for LOT LAXAIM</w:t>
-      </w:r>
-    </w:p>
-    <w:p>
-      <w:r>
         <w:br/>
         <w:br/>
+        <w:t>Pickup Prediction Results for LOT LAXAIM</w:t>
       </w:r>
     </w:p>
     <w:p>
@@ -76,13 +75,9 @@
         <w:pStyle w:val="Heading2"/>
       </w:pPr>
       <w:r>
-        <w:t>Pickup Prediction Results for LOT LAXCSN</w:t>
-      </w:r>
-    </w:p>
-    <w:p>
-      <w:r>
         <w:br/>
         <w:br/>
+        <w:t>Pickup Prediction Results for LOT LAXCSN</w:t>
       </w:r>
     </w:p>
     <w:p>
@@ -126,13 +121,9 @@
         <w:pStyle w:val="Heading2"/>
       </w:pPr>
       <w:r>
-        <w:t>Pickup Prediction Results for LOT CHIIIC</w:t>
-      </w:r>
-    </w:p>
-    <w:p>
-      <w:r>
         <w:br/>
         <w:br/>
+        <w:t>Pickup Prediction Results for LOT CHIIIC</w:t>
       </w:r>
     </w:p>
     <w:p>
@@ -176,13 +167,9 @@
         <w:pStyle w:val="Heading2"/>
       </w:pPr>
       <w:r>
-        <w:t>Pickup Prediction Results for LOT WBCT</w:t>
-      </w:r>
-    </w:p>
-    <w:p>
-      <w:r>
         <w:br/>
         <w:br/>
+        <w:t>Pickup Prediction Results for LOT WBCT</w:t>
       </w:r>
     </w:p>
     <w:p>
@@ -226,13 +213,9 @@
         <w:pStyle w:val="Heading2"/>
       </w:pPr>
       <w:r>
-        <w:t>Pickup Prediction Results for LOT LAXICE</w:t>
-      </w:r>
-    </w:p>
-    <w:p>
-      <w:r>
         <w:br/>
         <w:br/>
+        <w:t>Pickup Prediction Results for LOT LAXICE</w:t>
       </w:r>
     </w:p>
     <w:p>
@@ -276,13 +259,9 @@
         <w:pStyle w:val="Heading2"/>
       </w:pPr>
       <w:r>
-        <w:t>Pickup Prediction Results for LOT SAVCMP</w:t>
-      </w:r>
-    </w:p>
-    <w:p>
-      <w:r>
         <w:br/>
         <w:br/>
+        <w:t>Pickup Prediction Results for LOT SAVCMP</w:t>
       </w:r>
     </w:p>
     <w:p>
@@ -326,13 +305,9 @@
         <w:pStyle w:val="Heading2"/>
       </w:pPr>
       <w:r>
-        <w:t>Pickup Prediction Results for LOT OAKSTE</w:t>
-      </w:r>
-    </w:p>
-    <w:p>
-      <w:r>
         <w:br/>
         <w:br/>
+        <w:t>Pickup Prediction Results for LOT OAKSTE</w:t>
       </w:r>
     </w:p>
     <w:p>
@@ -376,13 +351,9 @@
         <w:pStyle w:val="Heading2"/>
       </w:pPr>
       <w:r>
-        <w:t>Pickup Prediction Results for LOT TACTHG</w:t>
-      </w:r>
-    </w:p>
-    <w:p>
-      <w:r>
         <w:br/>
         <w:br/>
+        <w:t>Pickup Prediction Results for LOT TACTHG</w:t>
       </w:r>
     </w:p>
     <w:p>
@@ -426,13 +397,9 @@
         <w:pStyle w:val="Heading2"/>
       </w:pPr>
       <w:r>
-        <w:t>Pickup Prediction Results for LOT LAXBAC</w:t>
-      </w:r>
-    </w:p>
-    <w:p>
-      <w:r>
         <w:br/>
         <w:br/>
+        <w:t>Pickup Prediction Results for LOT LAXBAC</w:t>
       </w:r>
     </w:p>
     <w:p>
@@ -476,13 +443,9 @@
         <w:pStyle w:val="Heading2"/>
       </w:pPr>
       <w:r>
-        <w:t>Pickup Prediction Results for LOT ORFMRS</w:t>
-      </w:r>
-    </w:p>
-    <w:p>
-      <w:r>
         <w:br/>
         <w:br/>
+        <w:t>Pickup Prediction Results for LOT ORFMRS</w:t>
       </w:r>
     </w:p>
     <w:p>
@@ -526,13 +489,9 @@
         <w:pStyle w:val="Heading2"/>
       </w:pPr>
       <w:r>
-        <w:t>Pickup Prediction Results for LOT SEASPK</w:t>
-      </w:r>
-    </w:p>
-    <w:p>
-      <w:r>
         <w:br/>
         <w:br/>
+        <w:t>Pickup Prediction Results for LOT SEASPK</w:t>
       </w:r>
     </w:p>
     <w:p>
@@ -576,13 +535,9 @@
         <w:pStyle w:val="Heading2"/>
       </w:pPr>
       <w:r>
-        <w:t>Pickup Prediction Results for LOT LT03JA</w:t>
-      </w:r>
-    </w:p>
-    <w:p>
-      <w:r>
         <w:br/>
         <w:br/>
+        <w:t>Pickup Prediction Results for LOT LT03JA</w:t>
       </w:r>
     </w:p>
     <w:p>
@@ -626,13 +581,9 @@
         <w:pStyle w:val="Heading2"/>
       </w:pPr>
       <w:r>
-        <w:t>Pickup Prediction Results for LOT SBTAMO</w:t>
-      </w:r>
-    </w:p>
-    <w:p>
-      <w:r>
         <w:br/>
         <w:br/>
+        <w:t>Pickup Prediction Results for LOT SBTAMO</w:t>
       </w:r>
     </w:p>
     <w:p>
@@ -676,13 +627,9 @@
         <w:pStyle w:val="Heading2"/>
       </w:pPr>
       <w:r>
-        <w:t>Pickup Prediction Results for LOT HOUCMC</w:t>
-      </w:r>
-    </w:p>
-    <w:p>
-      <w:r>
         <w:br/>
         <w:br/>
+        <w:t>Pickup Prediction Results for LOT HOUCMC</w:t>
       </w:r>
     </w:p>
     <w:p>

</xml_diff>